<commit_message>
Lafond Parte 3: revisão
Co-Authored-By: Claude Opus 5.5 <noreply@anthropic.com>
Claude-Session: https://claude.ai/code/session_01MJjUEEZrxQDEUifKK2vj9g
</commit_message>
<xml_diff>
--- a/roteiros/jorge-lafond/Lafond_Parte3.docx
+++ b/roteiros/jorge-lafond/Lafond_Parte3.docx
@@ -15,15 +15,7 @@
         <w:rPr>
           <w:color w:val="000000"/>
         </w:rPr>
-        <w:t>Era dez de novembro de dois mil e dois.</w:t>
-      </w:r>
-    </w:p>
-    <w:p>
-      <w:r>
-        <w:rPr>
-          <w:color w:val="000000"/>
-        </w:rPr>
-        <w:t>No palco do Domingo Legal, o quadro Homens contra Mulheres dividia os convidados em dois times. A Vera Verão entrou do lado das mulheres.</w:t>
+        <w:t>Naquele domingo, no palco do Domingo Legal, o quadro Homens contra Mulheres dividia os convidados em dois times. A Vera Verão entrou do lado das mulheres.</w:t>
       </w:r>
     </w:p>
     <w:p>
@@ -143,7 +135,7 @@
         <w:rPr>
           <w:color w:val="000000"/>
         </w:rPr>
-        <w:t>Aos cinquenta, famoso no país inteiro, foi tirado de um palco vestido justamente com a personagem que tinha dado a ele tudo o que tinha.</w:t>
+        <w:t>Aos cinquenta, famoso no país inteiro, foi tirado de um palco vestido justamente da personagem que tinha mudado a vida dele.</w:t>
       </w:r>
     </w:p>
     <w:p>
@@ -311,7 +303,7 @@
         <w:rPr>
           <w:color w:val="000000"/>
         </w:rPr>
-        <w:t>Jorge seria velado e enterrado no Cemitério de Irajá, na zona norte. O mesmo bairro onde, décadas antes, ele dançava em cabarés sem que ninguém soubesse o nome dele.</w:t>
+        <w:t>Jorge seria velado e enterrado no Cemitério de Irajá, na zona norte. A mesma região onde, décadas antes, ele dançava em cabarés sem que ninguém soubesse o nome dele.</w:t>
       </w:r>
     </w:p>
     <w:p>
@@ -463,7 +455,7 @@
         <w:rPr>
           <w:color w:val="000000"/>
         </w:rPr>
-        <w:t>Aquele saco nunca foi aberto. Desceu para a sepultura junto com Jorge Lafond.</w:t>
+        <w:t>Aquele saco foi lacrado e desceu para a sepultura junto com Jorge Lafond.</w:t>
       </w:r>
     </w:p>
     <w:p>

</xml_diff>